<commit_message>
Auditor role added & Testing modules
</commit_message>
<xml_diff>
--- a/Travel_Agency_Raport_Teknik.docx
+++ b/Travel_Agency_Raport_Teknik.docx
@@ -371,7 +371,7 @@
                 <w:b w:val="0"/>
                 <w:sz w:val="20"/>
               </w:rPr>
-              <w:t>09.06.2026</w:t>
+              <w:t>10.06.2026</w:t>
             </w:r>
           </w:p>
         </w:tc>
@@ -519,7 +519,7 @@
     </w:p>
     <w:p>
       <w:r>
-        <w:t>Sistemi perfshin autentifikim me JWT, autorizim sipas roleve admin/user, MFA per role te mbrojtura me queue/email delivery, validim te input-eve, password hashing, rate limiting, audit logging, distributed caching, RabbitMQ, Swagger examples, Prometheus metrics, ELK log shipping, Kubernetes manifests, Playwright E2E tests, Dockerfile dhe docker-compose baze/enterprise. Ai permbush kerkesat kryesore te lendes Web Services dhe Web API dhe demonstron ne menyre konkrete kerkesat e avancuara.</w:t>
+        <w:t>Sistemi perfshin autentifikim me JWT, autorizim sipas roleve admin/user/auditor, MFA per role te mbrojtura me queue/email delivery, validim te input-eve, password hashing, rate limiting, audit logging, distributed caching, RabbitMQ, Swagger examples, Prometheus metrics, ELK log shipping, Kubernetes manifests, Playwright E2E tests, Dockerfile dhe docker-compose baze/enterprise. Ai permbush kerkesat kryesore te lendes Web Services dhe Web API dhe demonstron ne menyre konkrete kerkesat e avancuara.</w:t>
       </w:r>
     </w:p>
     <w:p>
@@ -532,7 +532,7 @@
     </w:p>
     <w:p>
       <w:r>
-        <w:t>Qellimi i projektit eshte krijimi i nje platforme funksionale per agjenci udhetimi, ku perdoruesit mund te shohin destinacione dhe paketa, te bejne rezervime dhe te komunikojne me stafin, ndersa administratori menaxhon katalogun dhe te dhenat operative.</w:t>
+        <w:t>Qellimi i projektit eshte krijimi i nje platforme funksionale per agjenci udhetimi, ku perdoruesit mund te shohin destinacione dhe paketa, te bejne rezervime dhe te komunikojne me stafin. Administratori menaxhon katalogun dhe te dhenat operative, kurse auditori ka qasje vetem per lexim ne auditim dhe raportim.</w:t>
       </w:r>
     </w:p>
     <w:p>
@@ -548,7 +548,7 @@
         <w:pStyle w:val="ListBullet"/>
       </w:pPr>
       <w:r>
-        <w:t>Te perdoret JWT per autentifikim stateless dhe RBAC per ndarjen e lejeve admin/user.</w:t>
+        <w:t>Te perdoret JWT per autentifikim stateless dhe RBAC per ndarjen e lejeve admin/user/auditor.</w:t>
       </w:r>
     </w:p>
     <w:p>
@@ -556,7 +556,7 @@
         <w:pStyle w:val="ListBullet"/>
       </w:pPr>
       <w:r>
-        <w:t>Te shtohet MFA per role te ndjeshme si admin me delivery permes RabbitMQ/email.</w:t>
+        <w:t>Te shtohet MFA per role te ndjeshme si admin dhe auditor me delivery permes RabbitMQ/email.</w:t>
       </w:r>
     </w:p>
     <w:p>
@@ -1172,7 +1172,7 @@
                 <w:b w:val="0"/>
                 <w:sz w:val="17"/>
               </w:rPr>
-              <w:t>Autentifikim dhe autorizim sipas roleve.</w:t>
+              <w:t>Autentifikim dhe autorizim sipas roleve admin/user/auditor.</w:t>
             </w:r>
           </w:p>
         </w:tc>
@@ -2854,7 +2854,7 @@
         <w:pStyle w:val="ListBullet"/>
       </w:pPr>
       <w:r>
-        <w:t>Lejon ndarjen e autorizimeve admin/user.</w:t>
+        <w:t>Lejon ndarjen e autorizimeve admin/user/auditor.</w:t>
       </w:r>
     </w:p>
     <w:p>
@@ -2875,7 +2875,7 @@
     </w:p>
     <w:p>
       <w:r>
-        <w:t>Role-Based Access Control ndan funksionet e user-it normal nga funksionet administrative. Admin menaxhon katalogun, bookings, users dhe messages. User mund te beje booking, te shikoje rezervimet e veta, te ndryshoje profilin/password dhe te dergoje mesazhe kontakti.</w:t>
+        <w:t>Role-Based Access Control ndan funksionet e user-it normal, auditorit read-only dhe funksioneve administrative. Admin menaxhon katalogun, bookings, users dhe messages. User mund te beje booking, te shikoje rezervimet e veta, te ndryshoje profilin/password dhe te dergoje mesazhe kontakti. Auditor mund te lexoje audit logs, metrics, bookings, users, contact messages dhe stats pa leje ndryshimi.</w:t>
       </w:r>
     </w:p>
     <w:p>
@@ -2915,7 +2915,7 @@
         <w:pStyle w:val="ListBullet"/>
       </w:pPr>
       <w:r>
-        <w:t>MFA aplikohet per role te konfiguruara si admin dhe mund te dergohet permes RabbitMQ/email.</w:t>
+        <w:t>MFA aplikohet per role te konfiguruara si admin dhe auditor dhe mund te dergohet permes RabbitMQ/email.</w:t>
       </w:r>
     </w:p>
     <w:p>
@@ -3912,7 +3912,7 @@
                 <w:b w:val="0"/>
                 <w:sz w:val="16"/>
               </w:rPr>
-              <w:t>Role admin/user per autorizim.</w:t>
+              <w:t>Role admin/user/auditor per autorizim.</w:t>
             </w:r>
           </w:p>
         </w:tc>
@@ -4946,7 +4946,15 @@
         <w:pStyle w:val="ListBullet"/>
       </w:pPr>
       <w:r>
-        <w:t>Admin MFA: ne local demo kodi mund te kthehet ne pergjigje; ne production dergohet permes RabbitMQ/email.</w:t>
+        <w:t>Auditor login: auditor@travelagency.com / Auditor123!.</w:t>
+      </w:r>
+    </w:p>
+    <w:p>
+      <w:pPr>
+        <w:pStyle w:val="ListBullet"/>
+      </w:pPr>
+      <w:r>
+        <w:t>Admin dhe auditor MFA: ne local demo kodi mund te kthehet ne pergjigje; ne production dergohet permes RabbitMQ/email.</w:t>
       </w:r>
     </w:p>
     <w:p>

</xml_diff>